<commit_message>
fix: correct speaker assignments and price in source doc, reindex
The knowledge base contradicted the system prompt, which is why the bot
mixed up who teaches what. Corrected at the source instead of relying
only on the prompt-priority rule:

- Жексен Васильевич: Масштабирование -> Систематизация и автоматизация
- Даяна Асанова: Систематизация/автоматизация/масштабирование -> Масштабирование бизнеса
- Price: "до 50 000 тенге" -> "50 000 тенге. Срок обучения: 1 месяц"

Rebuilt FAISS index (36 chunks). Verified no stale strings remain.

Co-Authored-By: Claude Opus 5 <noreply@anthropic.com>
</commit_message>
<xml_diff>
--- a/data/product_docs/База для ИИ продажника.docx
+++ b/data/product_docs/База для ИИ продажника.docx
@@ -4262,7 +4262,7 @@
           <w:szCs w:val="18"/>
           <w:rtl w:val="0"/>
         </w:rPr>
-        <w:t xml:space="preserve">Целеполагание в бизнесе, Масштабирование бизнеса - Курманбек Жексен Васильевич</w:t>
+        <w:t>Целеполагание в бизнесе, Систематизация и автоматизация - Курманбек Жексен Васильевич</w:t>
       </w:r>
     </w:p>
     <w:p>
@@ -5640,7 +5640,7 @@
           <w:szCs w:val="18"/>
           <w:rtl w:val="0"/>
         </w:rPr>
-        <w:t xml:space="preserve">Систематизация, автоматизация и масштабирование - Асанова Даяна</w:t>
+        <w:t>Масштабирование бизнеса - Асанова Даяна</w:t>
       </w:r>
     </w:p>
     <w:p>
@@ -6880,9 +6880,9 @@
           <w:szCs w:val="24"/>
           <w:rtl w:val="0"/>
         </w:rPr>
-        <w:t xml:space="preserve">Стоимость продукта:</w:t>
-        <w:br w:type="textWrapping"/>
-        <w:t xml:space="preserve">до 50 000 тенге.</w:t>
+        <w:t>Стоимость продукта:</w:t>
+        <w:br/>
+        <w:t>50 000 тенге. Срок обучения: 1 месяц.</w:t>
       </w:r>
     </w:p>
     <w:p>

</xml_diff>